<commit_message>
Remove citations and references from Experiment 1 report
Co-Authored-By: Claude Opus 5.5 <noreply@anthropic.com>
</commit_message>
<xml_diff>
--- a/LAB-1/Experiment_1_Data_Visualization_Report.docx
+++ b/LAB-1/Experiment_1_Data_Visualization_Report.docx
@@ -130,7 +130,7 @@
     </w:p>
     <w:p>
       <w:r>
-        <w:t>"Data visualization uses charts, graphs and maps to present information clearly and simply. It turns complex data into visuals that are easy to understand.</w:t>
+        <w:t>"Data visualization uses charts, graphs and maps to present information clearly and simply. It turns complex data into visuals that are easy to understand."</w:t>
       </w:r>
     </w:p>
     <w:p>
@@ -236,7 +236,7 @@
         <w:t>Qualitative / Categorical data:</w:t>
       </w:r>
       <w:r>
-        <w:t xml:space="preserve"> "Information about something that can be sorted into different categories that can't be described directly by numbers." [2]</w:t>
+        <w:t xml:space="preserve"> "Information about something that can be sorted into different categories that can't be described directly by numbers."</w:t>
       </w:r>
     </w:p>
     <w:p>
@@ -250,7 +250,7 @@
         <w:t>Quantitative / Numerical data:</w:t>
       </w:r>
       <w:r>
-        <w:t xml:space="preserve"> "Information about something that is described by numbers." [2]</w:t>
+        <w:t xml:space="preserve"> "Information about something that is described by numbers."</w:t>
       </w:r>
     </w:p>
     <w:p>
@@ -278,7 +278,7 @@
       </w:pPr>
       <w:r>
         <w:lastRenderedPageBreak/>
-        <w:t>"Bar graphs are used [to] show the distribution of qualitative (categorical) data. It shows the frequency of values in the data. Frequency is the amount of times that value appeared in the data." [3]</w:t>
+        <w:t>"Bar graphs are used [to] show the distribution of qualitative (categorical) data. It shows the frequency of values in the data. Frequency is the amount of times that value appeared in the data."</w:t>
       </w:r>
     </w:p>
     <w:p>
@@ -286,7 +286,7 @@
         <w:pStyle w:val="ListBullet"/>
       </w:pPr>
       <w:r>
-        <w:t>In seaborn, a count plot is used to "Show the counts of observations in each categorical bin using bars." It can be thought of as "a histogram across a categorical, instead of quantitative, variable." [4]</w:t>
+        <w:t>In seaborn, a count plot is used to "Show the counts of observations in each categorical bin using bars." It can be thought of as "a histogram across a categorical, instead of quantitative, variable."</w:t>
       </w:r>
     </w:p>
     <w:p>
@@ -302,7 +302,7 @@
         <w:pStyle w:val="ListBullet"/>
       </w:pPr>
       <w:r>
-        <w:t>"A histogram is a widely used graph to show the distribution of quantitative (numerical) data." [5]</w:t>
+        <w:t>"A histogram is a widely used graph to show the distribution of quantitative (numerical) data."</w:t>
       </w:r>
     </w:p>
     <w:p>
@@ -310,7 +310,7 @@
         <w:pStyle w:val="ListBullet"/>
       </w:pPr>
       <w:r>
-        <w:t>Bins are "The intervals of values", and bin width is "the length of an interval." [5]</w:t>
+        <w:t>Bins are "The intervals of values", and bin width is "the length of an interval."</w:t>
       </w:r>
     </w:p>
     <w:p>
@@ -318,7 +318,7 @@
         <w:pStyle w:val="ListBullet"/>
       </w:pPr>
       <w:r>
-        <w:t>seaborn's histplot "can add a smooth curve obtained using a kernel density estimate" (KDE). [6]</w:t>
+        <w:t>seaborn's histplot "can add a smooth curve obtained using a kernel density estimate" (KDE).</w:t>
       </w:r>
     </w:p>
     <w:p>
@@ -334,7 +334,7 @@
         <w:pStyle w:val="ListBullet"/>
       </w:pPr>
       <w:r>
-        <w:t>"A Box Plot is also known as a Box and Whisker Plot and it is a graphical tool used to understand the distribution of numerical data." [7]</w:t>
+        <w:t>"A Box Plot is also known as a Box and Whisker Plot and it is a graphical tool used to understand the distribution of numerical data."</w:t>
       </w:r>
     </w:p>
     <w:p>
@@ -348,7 +348,7 @@
         <w:t>Minimum:</w:t>
       </w:r>
       <w:r>
-        <w:t xml:space="preserve"> "The smallest non-outlier value shown at the lower whisker end" [7]</w:t>
+        <w:t xml:space="preserve"> "The smallest non-outlier value shown at the lower whisker end"</w:t>
       </w:r>
     </w:p>
     <w:p>
@@ -362,7 +362,7 @@
         <w:t>First Quartile (Q1):</w:t>
       </w:r>
       <w:r>
-        <w:t xml:space="preserve"> "The value below which 25% of the data lies" [7]</w:t>
+        <w:t xml:space="preserve"> "The value below which 25% of the data lies"</w:t>
       </w:r>
     </w:p>
     <w:p>
@@ -376,7 +376,7 @@
         <w:t>Median (Q2):</w:t>
       </w:r>
       <w:r>
-        <w:t xml:space="preserve"> "The middle value that splits the data into two equal halves" [7]</w:t>
+        <w:t xml:space="preserve"> "The middle value that splits the data into two equal halves"</w:t>
       </w:r>
     </w:p>
     <w:p>
@@ -390,7 +390,7 @@
         <w:t>Third Quartile (Q3):</w:t>
       </w:r>
       <w:r>
-        <w:t xml:space="preserve"> "The value below which 75% of the data lies" [7]</w:t>
+        <w:t xml:space="preserve"> "The value below which 75% of the data lies"</w:t>
       </w:r>
     </w:p>
     <w:p>
@@ -404,7 +404,7 @@
         <w:t>Maximum:</w:t>
       </w:r>
       <w:r>
-        <w:t xml:space="preserve"> "The largest non-outlier value shown at the upper whisker end" [7]</w:t>
+        <w:t xml:space="preserve"> "The largest non-outlier value shown at the upper whisker end"</w:t>
       </w:r>
     </w:p>
     <w:p>
@@ -418,7 +418,7 @@
         <w:t>IQR:</w:t>
       </w:r>
       <w:r>
-        <w:t xml:space="preserve"> The box "covers the middle 50% of the data, making it a strong measure of spread that is resistant to extreme values." [7]</w:t>
+        <w:t xml:space="preserve"> The box "covers the middle 50% of the data, making it a strong measure of spread that is resistant to extreme values."</w:t>
       </w:r>
     </w:p>
     <w:p>
@@ -432,7 +432,7 @@
         <w:t>Outliers:</w:t>
       </w:r>
       <w:r>
-        <w:t xml:space="preserve"> "Any value below the lower limit or above the upper limit is treated as an outlier and shown as a separate point", where lower limit = Q1 − 1.5 × IQR and upper limit = Q3 + 1.5 × IQR. [7]</w:t>
+        <w:t xml:space="preserve"> "Any value below the lower limit or above the upper limit is treated as an outlier and shown as a separate point", where lower limit = Q1 − 1.5 × IQR and upper limit = Q3 + 1.5 × IQR.</w:t>
       </w:r>
     </w:p>
     <w:p>
@@ -448,7 +448,7 @@
         <w:pStyle w:val="ListBullet"/>
       </w:pPr>
       <w:r>
-        <w:t>"A scatter plot, also called a scatter graph, scattergram, scatter chart, or XY graph, uses dots to describe two different numeric variables." [8]</w:t>
+        <w:t>"A scatter plot, also called a scatter graph, scattergram, scatter chart, or XY graph, uses dots to describe two different numeric variables."</w:t>
       </w:r>
     </w:p>
     <w:p>
@@ -462,7 +462,7 @@
         <w:t>Positive correlation:</w:t>
       </w:r>
       <w:r>
-        <w:t xml:space="preserve"> "The value on the y-axis increases on moving from left to right." [8]</w:t>
+        <w:t xml:space="preserve"> "The value on the y-axis increases on moving from left to right."</w:t>
       </w:r>
     </w:p>
     <w:p>
@@ -476,7 +476,7 @@
         <w:t>Negative correlation:</w:t>
       </w:r>
       <w:r>
-        <w:t xml:space="preserve"> "The value on the y-axis decreases on moving from left to right." [8]</w:t>
+        <w:t xml:space="preserve"> "The value on the y-axis decreases on moving from left to right."</w:t>
       </w:r>
     </w:p>
     <w:p>
@@ -490,7 +490,7 @@
         <w:t>No correlation:</w:t>
       </w:r>
       <w:r>
-        <w:t xml:space="preserve"> "Values are scattered all over the graph." [8]</w:t>
+        <w:t xml:space="preserve"> "Values are scattered all over the graph."</w:t>
       </w:r>
     </w:p>
     <w:p>
@@ -506,7 +506,7 @@
         <w:pStyle w:val="ListBullet"/>
       </w:pPr>
       <w:r>
-        <w:t>"A correlation heatmap is a 2D graphical representation of a correlation matrix between multiple variables. It uses colored cells to indicate correlation values, making patterns and relationships within data visually interpretable." [9]</w:t>
+        <w:t>"A correlation heatmap is a 2D graphical representation of a correlation matrix between multiple variables. It uses colored cells to indicate correlation values, making patterns and relationships within data visually interpretable."</w:t>
       </w:r>
     </w:p>
     <w:p>
@@ -514,7 +514,7 @@
         <w:pStyle w:val="ListBullet"/>
       </w:pPr>
       <w:r>
-        <w:t>"The correlation coefficient measures the relationship between two variables." It "can never be less than -1 or higher than 1." [10]</w:t>
+        <w:t>"The correlation coefficient measures the relationship between two variables." It "can never be less than -1 or higher than 1."</w:t>
       </w:r>
     </w:p>
     <w:p>
@@ -546,7 +546,7 @@
         <w:t>−1:</w:t>
       </w:r>
       <w:r>
-        <w:t xml:space="preserve"> "there is a perfect negative linear relationship between the variables". [10]</w:t>
+        <w:t xml:space="preserve"> "there is a perfect negative linear relationship between the variables".</w:t>
       </w:r>
     </w:p>
     <w:p>
@@ -2846,73 +2846,6 @@
         <w:t xml:space="preserve"> makes patterns quick and easy to find.</w:t>
       </w:r>
     </w:p>
-    <w:p>
-      <w:pPr>
-        <w:pStyle w:val="Heading1"/>
-      </w:pPr>
-      <w:r>
-        <w:rPr>
-          <w:color w:val="1F4E79"/>
-        </w:rPr>
-        <w:t>References</w:t>
-      </w:r>
-    </w:p>
-    <w:p>
-      <w:r>
-        <w:t>[1] GeeksforGeeks, "What is Data Visualization and Why is it Important?" https://www.geeksforgeeks.org/what-is-data-visualization-and-why-is-it-important/</w:t>
-      </w:r>
-    </w:p>
-    <w:p>
-      <w:r>
-        <w:t>[2] W3Schools, "Statistics - Data Types." https://www.w3schools.com/statistics/statistics_data_types.php</w:t>
-      </w:r>
-    </w:p>
-    <w:p>
-      <w:r>
-        <w:t>[3] W3Schools, "Statistics - Bar Graphs." https://www.w3schools.com/statistics/statistics_bar_graphs.php</w:t>
-      </w:r>
-    </w:p>
-    <w:p>
-      <w:r>
-        <w:t>[4] seaborn documentation, "seaborn.countplot." https://seaborn.pydata.org/generated/seaborn.countplot.html</w:t>
-      </w:r>
-    </w:p>
-    <w:p>
-      <w:r>
-        <w:t>[5] W3Schools, "Statistics - Histograms." https://www.w3schools.com/statistics/statistics_histograms.php</w:t>
-      </w:r>
-    </w:p>
-    <w:p>
-      <w:r>
-        <w:lastRenderedPageBreak/>
-        <w:t>[6] seaborn documentation, "seaborn.histplot." https://seaborn.pydata.org/generated/seaborn.histplot.html</w:t>
-      </w:r>
-    </w:p>
-    <w:p>
-      <w:r>
-        <w:t>[7] GeeksforGeeks, "Box Plot." https://www.geeksforgeeks.org/box-plot/</w:t>
-      </w:r>
-    </w:p>
-    <w:p>
-      <w:r>
-        <w:t>[8] GeeksforGeeks, "Scatter Plot." https://www.geeksforgeeks.org/maths/scatter-plot/</w:t>
-      </w:r>
-    </w:p>
-    <w:p>
-      <w:r>
-        <w:t>[9] GeeksforGeeks, "How to create a seaborn correlation heatmap in Python?" https://www.geeksforgeeks.org/python/how-to-create-a-seaborn-correlation-heatmap-in-python/</w:t>
-      </w:r>
-    </w:p>
-    <w:p>
-      <w:r>
-        <w:t>[10] W3Schools, "Data Science - Statistics Correlation." https://www.w3schools.com/datascience/ds_stat_correlation.asp</w:t>
-      </w:r>
-    </w:p>
-    <w:p>
-      <w:r>
-        <w:t>[11] Kaggle, "Credit Card Details" dataset. https://www.kaggle.com/datasets/rohitudageri/credit-card-details</w:t>
-      </w:r>
-    </w:p>
     <w:sectPr>
       <w:footerReference w:type="default" r:id="rId17"/>
       <w:pgSz w:w="12240" w:h="15840"/>

</xml_diff>

<commit_message>
Fix Task 7 list numbering in Experiment 1 report
Co-Authored-By: Claude Opus 5.5 <noreply@anthropic.com>
</commit_message>
<xml_diff>
--- a/LAB-1/Experiment_1_Data_Visualization_Report.docx
+++ b/LAB-1/Experiment_1_Data_Visualization_Report.docx
@@ -2639,6 +2639,10 @@
     <w:p>
       <w:pPr>
         <w:pStyle w:val="ListNumber"/>
+        <w:numPr>
+          <w:ilvl w:val="0"/>
+          <w:numId w:val="10"/>
+        </w:numPr>
       </w:pPr>
       <w:r>
         <w:t xml:space="preserve">The dataset has </w:t>
@@ -2665,6 +2669,10 @@
     <w:p>
       <w:pPr>
         <w:pStyle w:val="ListNumber"/>
+        <w:numPr>
+          <w:ilvl w:val="0"/>
+          <w:numId w:val="10"/>
+        </w:numPr>
       </w:pPr>
       <w:r>
         <w:t>Four columns (Type_Occupation, Annual_income, Birthday_count, GENDER) had missing values. They were filled with "Unknown" or the median instead of deleting rows, so no data was lost.</w:t>
@@ -2673,6 +2681,10 @@
     <w:p>
       <w:pPr>
         <w:pStyle w:val="ListNumber"/>
+        <w:numPr>
+          <w:ilvl w:val="0"/>
+          <w:numId w:val="10"/>
+        </w:numPr>
       </w:pPr>
       <w:r>
         <w:rPr>
@@ -2687,6 +2699,10 @@
     <w:p>
       <w:pPr>
         <w:pStyle w:val="ListNumber"/>
+        <w:numPr>
+          <w:ilvl w:val="0"/>
+          <w:numId w:val="10"/>
+        </w:numPr>
       </w:pPr>
       <w:r>
         <w:t xml:space="preserve">Annual income is </w:t>
@@ -2713,6 +2729,10 @@
     <w:p>
       <w:pPr>
         <w:pStyle w:val="ListNumber"/>
+        <w:numPr>
+          <w:ilvl w:val="0"/>
+          <w:numId w:val="10"/>
+        </w:numPr>
       </w:pPr>
       <w:r>
         <w:t>Most applicants have Secondary / secondary special or Higher education.</w:t>
@@ -2721,6 +2741,10 @@
     <w:p>
       <w:pPr>
         <w:pStyle w:val="ListNumber"/>
+        <w:numPr>
+          <w:ilvl w:val="0"/>
+          <w:numId w:val="10"/>
+        </w:numPr>
       </w:pPr>
       <w:r>
         <w:t xml:space="preserve">Age and income show </w:t>
@@ -2738,6 +2762,10 @@
     <w:p>
       <w:pPr>
         <w:pStyle w:val="ListNumber"/>
+        <w:numPr>
+          <w:ilvl w:val="0"/>
+          <w:numId w:val="10"/>
+        </w:numPr>
       </w:pPr>
       <w:r>
         <w:t>CHILDREN and Family_Members are strongly related (0.89).</w:t>
@@ -2746,6 +2774,10 @@
     <w:p>
       <w:pPr>
         <w:pStyle w:val="ListNumber"/>
+        <w:numPr>
+          <w:ilvl w:val="0"/>
+          <w:numId w:val="10"/>
+        </w:numPr>
       </w:pPr>
       <w:r>
         <w:t>No single numerical column clearly decides approval or rejection.</w:t>
@@ -3120,6 +3152,12 @@
   </w:num>
   <w:num w:numId="9" w16cid:durableId="1781030440">
     <w:abstractNumId w:val="0"/>
+  </w:num>
+  <w:num w:numId="10">
+    <w:abstractNumId w:val="7"/>
+    <w:lvlOverride w:ilvl="0">
+      <w:startOverride w:val="1"/>
+    </w:lvlOverride>
   </w:num>
 </w:numbering>
 </file>

</xml_diff>

<commit_message>
Group report visualizations: screenshots, then reasons, then interpretations
Co-Authored-By: Claude Opus 5.5 <noreply@anthropic.com>
</commit_message>
<xml_diff>
--- a/LAB-1/Experiment_1_Data_Visualization_Report.docx
+++ b/LAB-1/Experiment_1_Data_Visualization_Report.docx
@@ -1942,37 +1942,6 @@
       </w:r>
     </w:p>
     <w:p>
-      <w:r>
-        <w:rPr>
-          <w:b/>
-        </w:rPr>
-        <w:t xml:space="preserve">Why this visualization? </w:t>
-      </w:r>
-      <w:r>
-        <w:t>Status is a categorical column with only two groups. A count plot draws one bar per group, and the bar height is the number of applications, so the two groups can be compared at a glance.</w:t>
-      </w:r>
-    </w:p>
-    <w:p>
-      <w:r>
-        <w:rPr>
-          <w:b/>
-        </w:rPr>
-        <w:t xml:space="preserve">Interpretation: </w:t>
-      </w:r>
-      <w:r>
-        <w:t xml:space="preserve">1,373 applications (88.7%) were approved and only 175 (11.3%) were rejected. The two groups are very unequal in size, so the data is </w:t>
-      </w:r>
-      <w:r>
-        <w:rPr>
-          <w:b/>
-        </w:rPr>
-        <w:t>imbalanced</w:t>
-      </w:r>
-      <w:r>
-        <w:t>: approved cases are about 8 times more common than rejected ones.</w:t>
-      </w:r>
-    </w:p>
-    <w:p>
       <w:pPr>
         <w:pStyle w:val="Heading2"/>
       </w:pPr>
@@ -2027,37 +1996,6 @@
       </w:r>
     </w:p>
     <w:p>
-      <w:r>
-        <w:rPr>
-          <w:b/>
-        </w:rPr>
-        <w:t xml:space="preserve">Why this visualization? </w:t>
-      </w:r>
-      <w:r>
-        <w:t>Annual_income is a numerical column. A histogram divides incomes into ranges (called bins) and shows how many people fall in each range, so it shows where most incomes lie. The smooth line on top (KDE) traces the overall shape of the bars.</w:t>
-      </w:r>
-    </w:p>
-    <w:p>
-      <w:r>
-        <w:rPr>
-          <w:b/>
-        </w:rPr>
-        <w:t xml:space="preserve">Interpretation: </w:t>
-      </w:r>
-      <w:r>
-        <w:t xml:space="preserve">Most applicants earn roughly 1,00,000 to 3,00,000. A few people earn much more (up to 15,75,000), which creates a long tail on the right side. This shape is called </w:t>
-      </w:r>
-      <w:r>
-        <w:rPr>
-          <w:b/>
-        </w:rPr>
-        <w:t>right-skewed</w:t>
-      </w:r>
-      <w:r>
-        <w:t>. It also explains why the mean income is higher than the median: the few high earners pull the mean up.</w:t>
-      </w:r>
-    </w:p>
-    <w:p>
       <w:pPr>
         <w:pStyle w:val="Heading2"/>
       </w:pPr>
@@ -2112,151 +2050,6 @@
       </w:r>
     </w:p>
     <w:p>
-      <w:r>
-        <w:rPr>
-          <w:b/>
-        </w:rPr>
-        <w:t xml:space="preserve">Why this visualization? </w:t>
-      </w:r>
-      <w:r>
-        <w:t xml:space="preserve">A box plot summarises a numerical column in one picture and clearly shows </w:t>
-      </w:r>
-      <w:r>
-        <w:rPr>
-          <w:b/>
-        </w:rPr>
-        <w:t>outliers</w:t>
-      </w:r>
-      <w:r>
-        <w:t xml:space="preserve"> (unusually high or low values). It adds to the histogram by marking exactly which values are extreme.</w:t>
-      </w:r>
-    </w:p>
-    <w:p>
-      <w:r>
-        <w:rPr>
-          <w:b/>
-        </w:rPr>
-        <w:t>How to read a box plot:</w:t>
-      </w:r>
-    </w:p>
-    <w:p>
-      <w:pPr>
-        <w:pStyle w:val="ListBullet"/>
-      </w:pPr>
-      <w:r>
-        <w:t xml:space="preserve">The </w:t>
-      </w:r>
-      <w:r>
-        <w:rPr>
-          <w:b/>
-        </w:rPr>
-        <w:t>box</w:t>
-      </w:r>
-      <w:r>
-        <w:t xml:space="preserve"> covers the middle 50% of people, from Q1 (25% of people earn less than this) to Q3 (75% of people earn less than this).</w:t>
-      </w:r>
-    </w:p>
-    <w:p>
-      <w:pPr>
-        <w:pStyle w:val="ListBullet"/>
-      </w:pPr>
-      <w:r>
-        <w:t xml:space="preserve">The </w:t>
-      </w:r>
-      <w:r>
-        <w:rPr>
-          <w:b/>
-        </w:rPr>
-        <w:t>line inside the box</w:t>
-      </w:r>
-      <w:r>
-        <w:t xml:space="preserve"> is the median.</w:t>
-      </w:r>
-    </w:p>
-    <w:p>
-      <w:pPr>
-        <w:pStyle w:val="ListBullet"/>
-      </w:pPr>
-      <w:r>
-        <w:t xml:space="preserve">The </w:t>
-      </w:r>
-      <w:r>
-        <w:rPr>
-          <w:b/>
-        </w:rPr>
-        <w:t>whiskers</w:t>
-      </w:r>
-      <w:r>
-        <w:t xml:space="preserve"> (lines on both sides) show the normal range.</w:t>
-      </w:r>
-    </w:p>
-    <w:p>
-      <w:pPr>
-        <w:pStyle w:val="ListBullet"/>
-      </w:pPr>
-      <w:r>
-        <w:t xml:space="preserve">The </w:t>
-      </w:r>
-      <w:r>
-        <w:rPr>
-          <w:b/>
-        </w:rPr>
-        <w:t>dots</w:t>
-      </w:r>
-      <w:r>
-        <w:t xml:space="preserve"> beyond the whiskers are outliers.</w:t>
-      </w:r>
-    </w:p>
-    <w:p>
-      <w:r>
-        <w:rPr>
-          <w:b/>
-        </w:rPr>
-        <w:t>IQR rule for outliers:</w:t>
-      </w:r>
-      <w:r>
-        <w:t xml:space="preserve"> IQR (Inter-Quartile Range) = Q3 − Q1, which is the width of the box. Any income above Q3 + 1.5 × IQR is an outlier. The lower limit (Q1 − 1.5 × IQR) is negative here, so no income is a low outlier.</w:t>
-      </w:r>
-    </w:p>
-    <w:p>
-      <w:r>
-        <w:rPr>
-          <w:b/>
-        </w:rPr>
-        <w:t xml:space="preserve">Interpretation: </w:t>
-      </w:r>
-      <w:r>
-        <w:t xml:space="preserve">The middle 50% of applicants earn between 1,21,500 (Q1) and 2,25,000 (Q3), so IQR = 1,03,500. Any income above </w:t>
-      </w:r>
-      <w:r>
-        <w:rPr>
-          <w:b/>
-        </w:rPr>
-        <w:t>3,80,250</w:t>
-      </w:r>
-      <w:r>
-        <w:t xml:space="preserve"> is an outlier, and </w:t>
-      </w:r>
-      <w:r>
-        <w:rPr>
-          <w:b/>
-        </w:rPr>
-        <w:t>73 applicants</w:t>
-      </w:r>
-      <w:r>
-        <w:t xml:space="preserve"> are above this limit. These outliers were </w:t>
-      </w:r>
-      <w:r>
-        <w:rPr>
-          <w:b/>
-        </w:rPr>
-        <w:t>not removed</w:t>
-      </w:r>
-      <w:r>
-        <w:t>, because high incomes are real and possible. They belong to genuine applicants and are not typing mistakes.</w:t>
-      </w:r>
-    </w:p>
-    <w:p>
       <w:pPr>
         <w:pStyle w:val="Heading2"/>
       </w:pPr>
@@ -2311,46 +2104,6 @@
       </w:r>
     </w:p>
     <w:p>
-      <w:r>
-        <w:rPr>
-          <w:b/>
-        </w:rPr>
-        <w:t xml:space="preserve">Why this visualization? </w:t>
-      </w:r>
-      <w:r>
-        <w:t xml:space="preserve">EDUCATION is a categorical column, so a count plot is used to compare how many people are in each category. The bars are </w:t>
-      </w:r>
-      <w:r>
-        <w:rPr>
-          <w:b/>
-        </w:rPr>
-        <w:t>horizontal</w:t>
-      </w:r>
-      <w:r>
-        <w:t xml:space="preserve"> because the category names are long and would overlap on the x-axis, and they are </w:t>
-      </w:r>
-      <w:r>
-        <w:rPr>
-          <w:b/>
-        </w:rPr>
-        <w:t>sorted</w:t>
-      </w:r>
-      <w:r>
-        <w:t xml:space="preserve"> from most to least common so the chart is easy to read.</w:t>
-      </w:r>
-    </w:p>
-    <w:p>
-      <w:r>
-        <w:rPr>
-          <w:b/>
-        </w:rPr>
-        <w:t xml:space="preserve">Interpretation: </w:t>
-      </w:r>
-      <w:r>
-        <w:t>Most applicants have Secondary / secondary special education (1,031, about 67%), followed by Higher education (426, about 28%). The other categories are small: Incomplete higher (68), Lower secondary (21), and Academic degree (only 2). So the applicants mainly come from two education groups.</w:t>
-      </w:r>
-    </w:p>
-    <w:p>
       <w:pPr>
         <w:pStyle w:val="Heading2"/>
       </w:pPr>
@@ -2405,46 +2158,6 @@
       </w:r>
     </w:p>
     <w:p>
-      <w:r>
-        <w:rPr>
-          <w:b/>
-        </w:rPr>
-        <w:t xml:space="preserve">Why this visualization? </w:t>
-      </w:r>
-      <w:r>
-        <w:t>A scatter plot shows whether two numerical columns are related. Each dot is one applicant, with age on the x-axis and income on the y-axis. The dots are also coloured by Status (Approved / Rejected) to check whether the two groups fall in different areas of the chart.</w:t>
-      </w:r>
-    </w:p>
-    <w:p>
-      <w:r>
-        <w:rPr>
-          <w:b/>
-        </w:rPr>
-        <w:t xml:space="preserve">Interpretation: </w:t>
-      </w:r>
-      <w:r>
-        <w:t xml:space="preserve">Applicants are between about 21 and 68 years old. The dots are spread out with </w:t>
-      </w:r>
-      <w:r>
-        <w:rPr>
-          <w:b/>
-        </w:rPr>
-        <w:t>no clear upward or downward trend</w:t>
-      </w:r>
-      <w:r>
-        <w:t xml:space="preserve">, so income does not clearly increase or decrease with age. The Approved and Rejected dots are </w:t>
-      </w:r>
-      <w:r>
-        <w:rPr>
-          <w:b/>
-        </w:rPr>
-        <w:t>mixed together</w:t>
-      </w:r>
-      <w:r>
-        <w:t xml:space="preserve"> in the same areas, so age and income alone cannot tell whether an application will be approved.</w:t>
-      </w:r>
-    </w:p>
-    <w:p>
       <w:pPr>
         <w:pStyle w:val="Heading2"/>
       </w:pPr>
@@ -2499,12 +2212,222 @@
       </w:r>
     </w:p>
     <w:p>
+      <w:pPr>
+        <w:pStyle w:val="Heading2"/>
+      </w:pPr>
+      <w:r>
+        <w:rPr>
+          <w:color w:val="1F4E79"/>
+        </w:rPr>
+        <w:t>Why this visualization?</w:t>
+      </w:r>
+    </w:p>
+    <w:p>
+      <w:pPr>
+        <w:spacing w:before="200"/>
+      </w:pPr>
       <w:r>
         <w:rPr>
           <w:b/>
         </w:rPr>
-        <w:t xml:space="preserve">Why this visualization? </w:t>
-      </w:r>
+        <w:t xml:space="preserve">1. Approved vs Rejected Applications (Count Plot)</w:t>
+      </w:r>
+    </w:p>
+    <w:p>
+      <w:r>
+        <w:t>Status is a categorical column with only two groups. A count plot draws one bar per group, and the bar height is the number of applications, so the two groups can be compared at a glance.</w:t>
+      </w:r>
+    </w:p>
+    <w:p>
+      <w:pPr>
+        <w:spacing w:before="200"/>
+      </w:pPr>
+      <w:r>
+        <w:rPr>
+          <w:b/>
+        </w:rPr>
+        <w:t xml:space="preserve">2. Distribution of Annual Income (Histogram)</w:t>
+      </w:r>
+    </w:p>
+    <w:p>
+      <w:r>
+        <w:t>Annual_income is a numerical column. A histogram divides incomes into ranges (called bins) and shows how many people fall in each range, so it shows where most incomes lie. The smooth line on top (KDE) traces the overall shape of the bars.</w:t>
+      </w:r>
+    </w:p>
+    <w:p>
+      <w:pPr>
+        <w:spacing w:before="200"/>
+      </w:pPr>
+      <w:r>
+        <w:rPr>
+          <w:b/>
+        </w:rPr>
+        <w:t xml:space="preserve">3. Box Plot of Annual Income</w:t>
+      </w:r>
+    </w:p>
+    <w:p>
+      <w:r>
+        <w:t xml:space="preserve">A box plot summarises a numerical column in one picture and clearly shows </w:t>
+      </w:r>
+      <w:r>
+        <w:rPr>
+          <w:b/>
+        </w:rPr>
+        <w:t>outliers</w:t>
+      </w:r>
+      <w:r>
+        <w:t xml:space="preserve"> (unusually high or low values). It adds to the histogram by marking exactly which values are extreme.</w:t>
+      </w:r>
+    </w:p>
+    <w:p>
+      <w:r>
+        <w:rPr>
+          <w:b/>
+        </w:rPr>
+        <w:t>How to read a box plot:</w:t>
+      </w:r>
+    </w:p>
+    <w:p>
+      <w:pPr>
+        <w:pStyle w:val="ListBullet"/>
+      </w:pPr>
+      <w:r>
+        <w:t xml:space="preserve">The </w:t>
+      </w:r>
+      <w:r>
+        <w:rPr>
+          <w:b/>
+        </w:rPr>
+        <w:t>box</w:t>
+      </w:r>
+      <w:r>
+        <w:t xml:space="preserve"> covers the middle 50% of people, from Q1 (25% of people earn less than this) to Q3 (75% of people earn less than this).</w:t>
+      </w:r>
+    </w:p>
+    <w:p>
+      <w:pPr>
+        <w:pStyle w:val="ListBullet"/>
+      </w:pPr>
+      <w:r>
+        <w:t xml:space="preserve">The </w:t>
+      </w:r>
+      <w:r>
+        <w:rPr>
+          <w:b/>
+        </w:rPr>
+        <w:t>line inside the box</w:t>
+      </w:r>
+      <w:r>
+        <w:t xml:space="preserve"> is the median.</w:t>
+      </w:r>
+    </w:p>
+    <w:p>
+      <w:pPr>
+        <w:pStyle w:val="ListBullet"/>
+      </w:pPr>
+      <w:r>
+        <w:t xml:space="preserve">The </w:t>
+      </w:r>
+      <w:r>
+        <w:rPr>
+          <w:b/>
+        </w:rPr>
+        <w:t>whiskers</w:t>
+      </w:r>
+      <w:r>
+        <w:t xml:space="preserve"> (lines on both sides) show the normal range.</w:t>
+      </w:r>
+    </w:p>
+    <w:p>
+      <w:pPr>
+        <w:pStyle w:val="ListBullet"/>
+      </w:pPr>
+      <w:r>
+        <w:t xml:space="preserve">The </w:t>
+      </w:r>
+      <w:r>
+        <w:rPr>
+          <w:b/>
+        </w:rPr>
+        <w:t>dots</w:t>
+      </w:r>
+      <w:r>
+        <w:t xml:space="preserve"> beyond the whiskers are outliers.</w:t>
+      </w:r>
+    </w:p>
+    <w:p>
+      <w:r>
+        <w:rPr>
+          <w:b/>
+        </w:rPr>
+        <w:t>IQR rule for outliers:</w:t>
+      </w:r>
+      <w:r>
+        <w:t xml:space="preserve"> IQR (Inter-Quartile Range) = Q3 − Q1, which is the width of the box. Any income above Q3 + 1.5 × IQR is an outlier. The lower limit (Q1 − 1.5 × IQR) is negative here, so no income is a low outlier.</w:t>
+      </w:r>
+    </w:p>
+    <w:p>
+      <w:pPr>
+        <w:spacing w:before="200"/>
+      </w:pPr>
+      <w:r>
+        <w:rPr>
+          <w:b/>
+        </w:rPr>
+        <w:t xml:space="preserve">4. Education Levels (Horizontal Count Plot)</w:t>
+      </w:r>
+    </w:p>
+    <w:p>
+      <w:r>
+        <w:t xml:space="preserve">EDUCATION is a categorical column, so a count plot is used to compare how many people are in each category. The bars are </w:t>
+      </w:r>
+      <w:r>
+        <w:rPr>
+          <w:b/>
+        </w:rPr>
+        <w:t>horizontal</w:t>
+      </w:r>
+      <w:r>
+        <w:t xml:space="preserve"> because the category names are long and would overlap on the x-axis, and they are </w:t>
+      </w:r>
+      <w:r>
+        <w:rPr>
+          <w:b/>
+        </w:rPr>
+        <w:t>sorted</w:t>
+      </w:r>
+      <w:r>
+        <w:t xml:space="preserve"> from most to least common so the chart is easy to read.</w:t>
+      </w:r>
+    </w:p>
+    <w:p>
+      <w:pPr>
+        <w:spacing w:before="200"/>
+      </w:pPr>
+      <w:r>
+        <w:rPr>
+          <w:b/>
+        </w:rPr>
+        <w:t xml:space="preserve">5. Age vs Annual Income (Scatter Plot)</w:t>
+      </w:r>
+    </w:p>
+    <w:p>
+      <w:r>
+        <w:t>A scatter plot shows whether two numerical columns are related. Each dot is one applicant, with age on the x-axis and income on the y-axis. The dots are also coloured by Status (Approved / Rejected) to check whether the two groups fall in different areas of the chart.</w:t>
+      </w:r>
+    </w:p>
+    <w:p>
+      <w:pPr>
+        <w:spacing w:before="200"/>
+      </w:pPr>
+      <w:r>
+        <w:rPr>
+          <w:b/>
+        </w:rPr>
+        <w:t xml:space="preserve">6. Correlation Heatmap</w:t>
+      </w:r>
+    </w:p>
+    <w:p>
       <w:r>
         <w:t xml:space="preserve">A heatmap shows the relationship between many pairs of numerical columns at once, in one grid. Each box shows a </w:t>
       </w:r>
@@ -2566,11 +2489,168 @@
       </w:r>
     </w:p>
     <w:p>
+      <w:pPr>
+        <w:pStyle w:val="Heading2"/>
+      </w:pPr>
+      <w:r>
+        <w:rPr>
+          <w:color w:val="1F4E79"/>
+        </w:rPr>
+        <w:t>Interpretation</w:t>
+      </w:r>
+    </w:p>
+    <w:p>
+      <w:pPr>
+        <w:spacing w:before="200"/>
+      </w:pPr>
       <w:r>
         <w:rPr>
           <w:b/>
         </w:rPr>
-        <w:t>Interpretation:</w:t>
+        <w:t xml:space="preserve">1. Approved vs Rejected Applications (Count Plot)</w:t>
+      </w:r>
+    </w:p>
+    <w:p>
+      <w:r>
+        <w:t xml:space="preserve">1,373 applications (88.7%) were approved and only 175 (11.3%) were rejected. The two groups are very unequal in size, so the data is </w:t>
+      </w:r>
+      <w:r>
+        <w:rPr>
+          <w:b/>
+        </w:rPr>
+        <w:t>imbalanced</w:t>
+      </w:r>
+      <w:r>
+        <w:t>: approved cases are about 8 times more common than rejected ones.</w:t>
+      </w:r>
+    </w:p>
+    <w:p>
+      <w:pPr>
+        <w:spacing w:before="200"/>
+      </w:pPr>
+      <w:r>
+        <w:rPr>
+          <w:b/>
+        </w:rPr>
+        <w:t xml:space="preserve">2. Distribution of Annual Income (Histogram)</w:t>
+      </w:r>
+    </w:p>
+    <w:p>
+      <w:r>
+        <w:t xml:space="preserve">Most applicants earn roughly 1,00,000 to 3,00,000. A few people earn much more (up to 15,75,000), which creates a long tail on the right side. This shape is called </w:t>
+      </w:r>
+      <w:r>
+        <w:rPr>
+          <w:b/>
+        </w:rPr>
+        <w:t>right-skewed</w:t>
+      </w:r>
+      <w:r>
+        <w:t>. It also explains why the mean income is higher than the median: the few high earners pull the mean up.</w:t>
+      </w:r>
+    </w:p>
+    <w:p>
+      <w:pPr>
+        <w:spacing w:before="200"/>
+      </w:pPr>
+      <w:r>
+        <w:rPr>
+          <w:b/>
+        </w:rPr>
+        <w:t xml:space="preserve">3. Box Plot of Annual Income</w:t>
+      </w:r>
+    </w:p>
+    <w:p>
+      <w:r>
+        <w:t xml:space="preserve">The middle 50% of applicants earn between 1,21,500 (Q1) and 2,25,000 (Q3), so IQR = 1,03,500. Any income above </w:t>
+      </w:r>
+      <w:r>
+        <w:rPr>
+          <w:b/>
+        </w:rPr>
+        <w:t>3,80,250</w:t>
+      </w:r>
+      <w:r>
+        <w:t xml:space="preserve"> is an outlier, and </w:t>
+      </w:r>
+      <w:r>
+        <w:rPr>
+          <w:b/>
+        </w:rPr>
+        <w:t>73 applicants</w:t>
+      </w:r>
+      <w:r>
+        <w:t xml:space="preserve"> are above this limit. These outliers were </w:t>
+      </w:r>
+      <w:r>
+        <w:rPr>
+          <w:b/>
+        </w:rPr>
+        <w:t>not removed</w:t>
+      </w:r>
+      <w:r>
+        <w:t>, because high incomes are real and possible. They belong to genuine applicants and are not typing mistakes.</w:t>
+      </w:r>
+    </w:p>
+    <w:p>
+      <w:pPr>
+        <w:spacing w:before="200"/>
+      </w:pPr>
+      <w:r>
+        <w:rPr>
+          <w:b/>
+        </w:rPr>
+        <w:t xml:space="preserve">4. Education Levels (Horizontal Count Plot)</w:t>
+      </w:r>
+    </w:p>
+    <w:p>
+      <w:r>
+        <w:t>Most applicants have Secondary / secondary special education (1,031, about 67%), followed by Higher education (426, about 28%). The other categories are small: Incomplete higher (68), Lower secondary (21), and Academic degree (only 2). So the applicants mainly come from two education groups.</w:t>
+      </w:r>
+    </w:p>
+    <w:p>
+      <w:pPr>
+        <w:spacing w:before="200"/>
+      </w:pPr>
+      <w:r>
+        <w:rPr>
+          <w:b/>
+        </w:rPr>
+        <w:t xml:space="preserve">5. Age vs Annual Income (Scatter Plot)</w:t>
+      </w:r>
+    </w:p>
+    <w:p>
+      <w:r>
+        <w:t xml:space="preserve">Applicants are between about 21 and 68 years old. The dots are spread out with </w:t>
+      </w:r>
+      <w:r>
+        <w:rPr>
+          <w:b/>
+        </w:rPr>
+        <w:t>no clear upward or downward trend</w:t>
+      </w:r>
+      <w:r>
+        <w:t xml:space="preserve">, so income does not clearly increase or decrease with age. The Approved and Rejected dots are </w:t>
+      </w:r>
+      <w:r>
+        <w:rPr>
+          <w:b/>
+        </w:rPr>
+        <w:t>mixed together</w:t>
+      </w:r>
+      <w:r>
+        <w:t xml:space="preserve"> in the same areas, so age and income alone cannot tell whether an application will be approved.</w:t>
+      </w:r>
+    </w:p>
+    <w:p>
+      <w:pPr>
+        <w:spacing w:before="200"/>
+      </w:pPr>
+      <w:r>
+        <w:rPr>
+          <w:b/>
+        </w:rPr>
+        <w:t xml:space="preserve">6. Correlation Heatmap</w:t>
       </w:r>
     </w:p>
     <w:p>

</xml_diff>

<commit_message>
Update report: trimmed text and grouped visualizations
Co-Authored-By: Claude Opus 5.5 <noreply@anthropic.com>
</commit_message>
<xml_diff>
--- a/LAB-1/Experiment_1_Data_Visualization_Report.docx
+++ b/LAB-1/Experiment_1_Data_Visualization_Report.docx
@@ -255,308 +255,13 @@
     </w:p>
     <w:p>
       <w:pPr>
-        <w:pStyle w:val="Heading2"/>
+        <w:pStyle w:val="Heading1"/>
       </w:pPr>
       <w:r>
         <w:rPr>
           <w:color w:val="1F4E79"/>
         </w:rPr>
-        <w:t>Plots Used in this Experiment</w:t>
-      </w:r>
-    </w:p>
-    <w:p>
-      <w:r>
-        <w:rPr>
-          <w:b/>
-        </w:rPr>
-        <w:t>1. Count Plot (Bar Graph)</w:t>
-      </w:r>
-    </w:p>
-    <w:p>
-      <w:pPr>
-        <w:pStyle w:val="ListBullet"/>
-      </w:pPr>
-      <w:r>
         <w:lastRenderedPageBreak/>
-        <w:t>"Bar graphs are used [to] show the distribution of qualitative (categorical) data. It shows the frequency of values in the data. Frequency is the amount of times that value appeared in the data."</w:t>
-      </w:r>
-    </w:p>
-    <w:p>
-      <w:pPr>
-        <w:pStyle w:val="ListBullet"/>
-      </w:pPr>
-      <w:r>
-        <w:t>In seaborn, a count plot is used to "Show the counts of observations in each categorical bin using bars." It can be thought of as "a histogram across a categorical, instead of quantitative, variable."</w:t>
-      </w:r>
-    </w:p>
-    <w:p>
-      <w:r>
-        <w:rPr>
-          <w:b/>
-        </w:rPr>
-        <w:t>2. Histogram</w:t>
-      </w:r>
-    </w:p>
-    <w:p>
-      <w:pPr>
-        <w:pStyle w:val="ListBullet"/>
-      </w:pPr>
-      <w:r>
-        <w:t>"A histogram is a widely used graph to show the distribution of quantitative (numerical) data."</w:t>
-      </w:r>
-    </w:p>
-    <w:p>
-      <w:pPr>
-        <w:pStyle w:val="ListBullet"/>
-      </w:pPr>
-      <w:r>
-        <w:t>Bins are "The intervals of values", and bin width is "the length of an interval."</w:t>
-      </w:r>
-    </w:p>
-    <w:p>
-      <w:pPr>
-        <w:pStyle w:val="ListBullet"/>
-      </w:pPr>
-      <w:r>
-        <w:t>seaborn's histplot "can add a smooth curve obtained using a kernel density estimate" (KDE).</w:t>
-      </w:r>
-    </w:p>
-    <w:p>
-      <w:r>
-        <w:rPr>
-          <w:b/>
-        </w:rPr>
-        <w:t>3. Box Plot</w:t>
-      </w:r>
-    </w:p>
-    <w:p>
-      <w:pPr>
-        <w:pStyle w:val="ListBullet"/>
-      </w:pPr>
-      <w:r>
-        <w:t>"A Box Plot is also known as a Box and Whisker Plot and it is a graphical tool used to understand the distribution of numerical data."</w:t>
-      </w:r>
-    </w:p>
-    <w:p>
-      <w:pPr>
-        <w:pStyle w:val="ListBullet"/>
-      </w:pPr>
-      <w:r>
-        <w:rPr>
-          <w:b/>
-        </w:rPr>
-        <w:t>Minimum:</w:t>
-      </w:r>
-      <w:r>
-        <w:t xml:space="preserve"> "The smallest non-outlier value shown at the lower whisker end"</w:t>
-      </w:r>
-    </w:p>
-    <w:p>
-      <w:pPr>
-        <w:pStyle w:val="ListBullet"/>
-      </w:pPr>
-      <w:r>
-        <w:rPr>
-          <w:b/>
-        </w:rPr>
-        <w:t>First Quartile (Q1):</w:t>
-      </w:r>
-      <w:r>
-        <w:t xml:space="preserve"> "The value below which 25% of the data lies"</w:t>
-      </w:r>
-    </w:p>
-    <w:p>
-      <w:pPr>
-        <w:pStyle w:val="ListBullet"/>
-      </w:pPr>
-      <w:r>
-        <w:rPr>
-          <w:b/>
-        </w:rPr>
-        <w:t>Median (Q2):</w:t>
-      </w:r>
-      <w:r>
-        <w:t xml:space="preserve"> "The middle value that splits the data into two equal halves"</w:t>
-      </w:r>
-    </w:p>
-    <w:p>
-      <w:pPr>
-        <w:pStyle w:val="ListBullet"/>
-      </w:pPr>
-      <w:r>
-        <w:rPr>
-          <w:b/>
-        </w:rPr>
-        <w:t>Third Quartile (Q3):</w:t>
-      </w:r>
-      <w:r>
-        <w:t xml:space="preserve"> "The value below which 75% of the data lies"</w:t>
-      </w:r>
-    </w:p>
-    <w:p>
-      <w:pPr>
-        <w:pStyle w:val="ListBullet"/>
-      </w:pPr>
-      <w:r>
-        <w:rPr>
-          <w:b/>
-        </w:rPr>
-        <w:t>Maximum:</w:t>
-      </w:r>
-      <w:r>
-        <w:t xml:space="preserve"> "The largest non-outlier value shown at the upper whisker end"</w:t>
-      </w:r>
-    </w:p>
-    <w:p>
-      <w:pPr>
-        <w:pStyle w:val="ListBullet"/>
-      </w:pPr>
-      <w:r>
-        <w:rPr>
-          <w:b/>
-        </w:rPr>
-        <w:t>IQR:</w:t>
-      </w:r>
-      <w:r>
-        <w:t xml:space="preserve"> The box "covers the middle 50% of the data, making it a strong measure of spread that is resistant to extreme values."</w:t>
-      </w:r>
-    </w:p>
-    <w:p>
-      <w:pPr>
-        <w:pStyle w:val="ListBullet"/>
-      </w:pPr>
-      <w:r>
-        <w:rPr>
-          <w:b/>
-        </w:rPr>
-        <w:t>Outliers:</w:t>
-      </w:r>
-      <w:r>
-        <w:t xml:space="preserve"> "Any value below the lower limit or above the upper limit is treated as an outlier and shown as a separate point", where lower limit = Q1 − 1.5 × IQR and upper limit = Q3 + 1.5 × IQR.</w:t>
-      </w:r>
-    </w:p>
-    <w:p>
-      <w:r>
-        <w:rPr>
-          <w:b/>
-        </w:rPr>
-        <w:t>4. Scatter Plot</w:t>
-      </w:r>
-    </w:p>
-    <w:p>
-      <w:pPr>
-        <w:pStyle w:val="ListBullet"/>
-      </w:pPr>
-      <w:r>
-        <w:t>"A scatter plot, also called a scatter graph, scattergram, scatter chart, or XY graph, uses dots to describe two different numeric variables."</w:t>
-      </w:r>
-    </w:p>
-    <w:p>
-      <w:pPr>
-        <w:pStyle w:val="ListBullet"/>
-      </w:pPr>
-      <w:r>
-        <w:rPr>
-          <w:b/>
-        </w:rPr>
-        <w:t>Positive correlation:</w:t>
-      </w:r>
-      <w:r>
-        <w:t xml:space="preserve"> "The value on the y-axis increases on moving from left to right."</w:t>
-      </w:r>
-    </w:p>
-    <w:p>
-      <w:pPr>
-        <w:pStyle w:val="ListBullet"/>
-      </w:pPr>
-      <w:r>
-        <w:rPr>
-          <w:b/>
-        </w:rPr>
-        <w:t>Negative correlation:</w:t>
-      </w:r>
-      <w:r>
-        <w:t xml:space="preserve"> "The value on the y-axis decreases on moving from left to right."</w:t>
-      </w:r>
-    </w:p>
-    <w:p>
-      <w:pPr>
-        <w:pStyle w:val="ListBullet"/>
-      </w:pPr>
-      <w:r>
-        <w:rPr>
-          <w:b/>
-        </w:rPr>
-        <w:t>No correlation:</w:t>
-      </w:r>
-      <w:r>
-        <w:t xml:space="preserve"> "Values are scattered all over the graph."</w:t>
-      </w:r>
-    </w:p>
-    <w:p>
-      <w:r>
-        <w:rPr>
-          <w:b/>
-        </w:rPr>
-        <w:t>5. Correlation Heatmap</w:t>
-      </w:r>
-    </w:p>
-    <w:p>
-      <w:pPr>
-        <w:pStyle w:val="ListBullet"/>
-      </w:pPr>
-      <w:r>
-        <w:t>"A correlation heatmap is a 2D graphical representation of a correlation matrix between multiple variables. It uses colored cells to indicate correlation values, making patterns and relationships within data visually interpretable."</w:t>
-      </w:r>
-    </w:p>
-    <w:p>
-      <w:pPr>
-        <w:pStyle w:val="ListBullet"/>
-      </w:pPr>
-      <w:r>
-        <w:t>"The correlation coefficient measures the relationship between two variables." It "can never be less than -1 or higher than 1."</w:t>
-      </w:r>
-    </w:p>
-    <w:p>
-      <w:pPr>
-        <w:pStyle w:val="ListBullet"/>
-      </w:pPr>
-      <w:r>
-        <w:rPr>
-          <w:b/>
-        </w:rPr>
-        <w:t>1:</w:t>
-      </w:r>
-      <w:r>
-        <w:t xml:space="preserve"> "there is a perfect linear relationship between the variables"; </w:t>
-      </w:r>
-      <w:r>
-        <w:rPr>
-          <w:b/>
-        </w:rPr>
-        <w:t>0:</w:t>
-      </w:r>
-      <w:r>
-        <w:t xml:space="preserve"> "there is no linear relationship between the variables"; </w:t>
-      </w:r>
-      <w:r>
-        <w:rPr>
-          <w:b/>
-        </w:rPr>
-        <w:t>−1:</w:t>
-      </w:r>
-      <w:r>
-        <w:t xml:space="preserve"> "there is a perfect negative linear relationship between the variables".</w:t>
-      </w:r>
-    </w:p>
-    <w:p>
-      <w:pPr>
-        <w:pStyle w:val="Heading1"/>
-      </w:pPr>
-      <w:r>
-        <w:rPr>
-          <w:color w:val="1F4E79"/>
-        </w:rPr>
         <w:t>Dataset</w:t>
       </w:r>
     </w:p>
@@ -585,7 +290,6 @@
     </w:p>
     <w:p>
       <w:r>
-        <w:lastRenderedPageBreak/>
         <w:t>The data comes as two CSV files:</w:t>
       </w:r>
     </w:p>
@@ -619,20 +323,6 @@
     </w:p>
     <w:p>
       <w:r>
-        <w:t xml:space="preserve">Both files have a common column </w:t>
-      </w:r>
-      <w:r>
-        <w:rPr>
-          <w:b/>
-        </w:rPr>
-        <w:t>Ind_ID</w:t>
-      </w:r>
-      <w:r>
-        <w:t xml:space="preserve"> (applicant ID), so they are joined on this column to make one table.</w:t>
-      </w:r>
-    </w:p>
-    <w:p>
-      <w:r>
         <w:t>Source: https://www.kaggle.com/datasets/rohitudageri/credit-card-details</w:t>
       </w:r>
     </w:p>
@@ -649,49 +339,7 @@
     </w:p>
     <w:p>
       <w:r>
-        <w:t>The two CSV files were loaded with pandas and joined on Ind_ID. The data was then inspected using:</w:t>
-      </w:r>
-    </w:p>
-    <w:p>
-      <w:pPr>
-        <w:pStyle w:val="ListBullet"/>
-      </w:pPr>
-      <w:r>
-        <w:rPr>
-          <w:b/>
-        </w:rPr>
-        <w:t>shape</w:t>
-      </w:r>
-      <w:r>
-        <w:t>: number of rows and columns.</w:t>
-      </w:r>
-    </w:p>
-    <w:p>
-      <w:pPr>
-        <w:pStyle w:val="ListBullet"/>
-      </w:pPr>
-      <w:r>
-        <w:rPr>
-          <w:b/>
-        </w:rPr>
-        <w:t>head()</w:t>
-      </w:r>
-      <w:r>
-        <w:t>: the first 5 rows, to see what the data looks like.</w:t>
-      </w:r>
-    </w:p>
-    <w:p>
-      <w:pPr>
-        <w:pStyle w:val="ListBullet"/>
-      </w:pPr>
-      <w:r>
-        <w:rPr>
-          <w:b/>
-        </w:rPr>
-        <w:t>info()</w:t>
-      </w:r>
-      <w:r>
-        <w:t>: each column's name, number of filled (non-empty) values, and data type.</w:t>
+        <w:t>The two CSV files were loaded with pandas and joined on Ind_ID</w:t>
       </w:r>
     </w:p>
     <w:p>
@@ -720,7 +368,7 @@
         <w:t>19 columns</w:t>
       </w:r>
       <w:r>
-        <w:t>. Some columns have fewer than 1,548 filled values, which means they have missing values. These are handled in Task 3.</w:t>
+        <w:t xml:space="preserve">. </w:t>
       </w:r>
     </w:p>
     <w:p>
@@ -776,48 +424,7 @@
         <w:t>Task 2 — Identify Numerical and Categorical Attributes</w:t>
       </w:r>
     </w:p>
-    <w:p>
-      <w:pPr>
-        <w:pStyle w:val="ListBullet"/>
-      </w:pPr>
-      <w:r>
-        <w:rPr>
-          <w:b/>
-        </w:rPr>
-        <w:t>Numerical</w:t>
-      </w:r>
-      <w:r>
-        <w:t xml:space="preserve"> attributes are numbers that are measured or counted, where maths makes sense (e.g. income, number of children).</w:t>
-      </w:r>
-    </w:p>
-    <w:p>
-      <w:pPr>
-        <w:pStyle w:val="ListBullet"/>
-      </w:pPr>
-      <w:r>
-        <w:rPr>
-          <w:b/>
-        </w:rPr>
-        <w:t>Categorical</w:t>
-      </w:r>
-      <w:r>
-        <w:t xml:space="preserve"> attributes put a person into a group or category (e.g. gender, education level).</w:t>
-      </w:r>
-    </w:p>
-    <w:p>
-      <w:r>
-        <w:t xml:space="preserve">This matters because </w:t>
-      </w:r>
-      <w:r>
-        <w:rPr>
-          <w:b/>
-        </w:rPr>
-        <w:t>the type of data decides the type of chart</w:t>
-      </w:r>
-      <w:r>
-        <w:t>. Numerical data suits histograms, box plots and scatter plots, while categorical data suits bar charts and count plots.</w:t>
-      </w:r>
-    </w:p>
+    <w:p/>
     <w:tbl>
       <w:tblPr>
         <w:tblStyle w:val="TableGrid"/>
@@ -922,11 +529,7 @@
           </w:tcPr>
           <w:p>
             <w:r>
-              <w:t xml:space="preserve">Categorical (stored as 0/1 </w:t>
-            </w:r>
-            <w:r>
-              <w:lastRenderedPageBreak/>
-              <w:t>numbers)</w:t>
+              <w:t>Categorical (stored as 0/1 numbers)</w:t>
             </w:r>
           </w:p>
         </w:tc>
@@ -936,7 +539,6 @@
           </w:tcPr>
           <w:p>
             <w:r>
-              <w:lastRenderedPageBreak/>
               <w:t>Mobile_phone, Work_Phone, Phone, EMAIL_ID, label</w:t>
             </w:r>
           </w:p>
@@ -986,7 +588,7 @@
         <w:t>Yes/No categories</w:t>
       </w:r>
       <w:r>
-        <w:t>. For example, the average of label has no real meaning, so these columns are treated as categorical.</w:t>
+        <w:t xml:space="preserve">. </w:t>
       </w:r>
     </w:p>
     <w:p>
@@ -994,6 +596,7 @@
         <w:rPr>
           <w:noProof/>
         </w:rPr>
+        <w:lastRenderedPageBreak/>
         <w:drawing>
           <wp:inline distT="0" distB="0" distL="0" distR="0" wp14:anchorId="29E7D3CD" wp14:editId="643D9E4A">
             <wp:extent cx="6309360" cy="1351915"/>
@@ -1042,41 +645,17 @@
         <w:t>Task 3 — Basic Pre-processing</w:t>
       </w:r>
     </w:p>
-    <w:p>
-      <w:r>
-        <w:t xml:space="preserve">Before making charts, the data was checked for </w:t>
-      </w:r>
-      <w:r>
-        <w:rPr>
-          <w:b/>
-        </w:rPr>
-        <w:t>duplicate rows</w:t>
-      </w:r>
-      <w:r>
-        <w:t xml:space="preserve"> and </w:t>
-      </w:r>
-      <w:r>
-        <w:rPr>
-          <w:b/>
-        </w:rPr>
-        <w:t>missing values</w:t>
-      </w:r>
-      <w:r>
-        <w:t>, so that the charts are based on clean data.</w:t>
-      </w:r>
-    </w:p>
+    <w:p/>
     <w:tbl>
       <w:tblPr>
         <w:tblStyle w:val="TableGrid"/>
-        <w:tblW w:w="9936" w:type="dxa"/>
+        <w:tblW w:w="3864" w:type="dxa"/>
         <w:jc w:val="center"/>
         <w:tblLook w:val="04A0" w:firstRow="1" w:lastRow="0" w:firstColumn="1" w:lastColumn="0" w:noHBand="0" w:noVBand="1"/>
       </w:tblPr>
       <w:tblGrid>
         <w:gridCol w:w="2208"/>
         <w:gridCol w:w="1656"/>
-        <w:gridCol w:w="2208"/>
-        <w:gridCol w:w="3864"/>
       </w:tblGrid>
       <w:tr>
         <w:trPr>
@@ -1110,34 +689,6 @@
             </w:r>
           </w:p>
         </w:tc>
-        <w:tc>
-          <w:tcPr>
-            <w:tcW w:w="2208" w:type="dxa"/>
-            <w:shd w:val="clear" w:color="auto" w:fill="D9E2F3"/>
-          </w:tcPr>
-          <w:p>
-            <w:r>
-              <w:rPr>
-                <w:b/>
-              </w:rPr>
-              <w:t>Action</w:t>
-            </w:r>
-          </w:p>
-        </w:tc>
-        <w:tc>
-          <w:tcPr>
-            <w:tcW w:w="3864" w:type="dxa"/>
-            <w:shd w:val="clear" w:color="auto" w:fill="D9E2F3"/>
-          </w:tcPr>
-          <w:p>
-            <w:r>
-              <w:rPr>
-                <w:b/>
-              </w:rPr>
-              <w:t>Reason</w:t>
-            </w:r>
-          </w:p>
-        </w:tc>
       </w:tr>
       <w:tr>
         <w:trPr>
@@ -1160,26 +711,6 @@
           <w:p>
             <w:r>
               <w:t>0</w:t>
-            </w:r>
-          </w:p>
-        </w:tc>
-        <w:tc>
-          <w:tcPr>
-            <w:tcW w:w="2208" w:type="dxa"/>
-          </w:tcPr>
-          <w:p>
-            <w:r>
-              <w:t>Nothing needed</w:t>
-            </w:r>
-          </w:p>
-        </w:tc>
-        <w:tc>
-          <w:tcPr>
-            <w:tcW w:w="3864" w:type="dxa"/>
-          </w:tcPr>
-          <w:p>
-            <w:r>
-              <w:t>No duplicate rows were found.</w:t>
             </w:r>
           </w:p>
         </w:tc>
@@ -1208,26 +739,6 @@
             </w:r>
           </w:p>
         </w:tc>
-        <w:tc>
-          <w:tcPr>
-            <w:tcW w:w="2208" w:type="dxa"/>
-          </w:tcPr>
-          <w:p>
-            <w:r>
-              <w:t>Filled with "Unknown"</w:t>
-            </w:r>
-          </w:p>
-        </w:tc>
-        <w:tc>
-          <w:tcPr>
-            <w:tcW w:w="3864" w:type="dxa"/>
-          </w:tcPr>
-          <w:p>
-            <w:r>
-              <w:t>Almost one-third of the rows are missing. Deleting them would lose too much data.</w:t>
-            </w:r>
-          </w:p>
-        </w:tc>
       </w:tr>
       <w:tr>
         <w:trPr>
@@ -1250,26 +761,6 @@
           <w:p>
             <w:r>
               <w:t>23 (1.49%)</w:t>
-            </w:r>
-          </w:p>
-        </w:tc>
-        <w:tc>
-          <w:tcPr>
-            <w:tcW w:w="2208" w:type="dxa"/>
-          </w:tcPr>
-          <w:p>
-            <w:r>
-              <w:t>Filled with the median</w:t>
-            </w:r>
-          </w:p>
-        </w:tc>
-        <w:tc>
-          <w:tcPr>
-            <w:tcW w:w="3864" w:type="dxa"/>
-          </w:tcPr>
-          <w:p>
-            <w:r>
-              <w:t>The mean (≈ 1,91,000) is higher than the median (1,66,500) because a few people earn very high incomes. The median (middle value) is not affected by these extreme values.</w:t>
             </w:r>
           </w:p>
         </w:tc>
@@ -1298,26 +789,6 @@
             </w:r>
           </w:p>
         </w:tc>
-        <w:tc>
-          <w:tcPr>
-            <w:tcW w:w="2208" w:type="dxa"/>
-          </w:tcPr>
-          <w:p>
-            <w:r>
-              <w:t>Filled with the median</w:t>
-            </w:r>
-          </w:p>
-        </w:tc>
-        <w:tc>
-          <w:tcPr>
-            <w:tcW w:w="3864" w:type="dxa"/>
-          </w:tcPr>
-          <w:p>
-            <w:r>
-              <w:t>Same reason: the median is a safe middle value.</w:t>
-            </w:r>
-          </w:p>
-        </w:tc>
       </w:tr>
       <w:tr>
         <w:trPr>
@@ -1343,40 +814,15 @@
             </w:r>
           </w:p>
         </w:tc>
-        <w:tc>
-          <w:tcPr>
-            <w:tcW w:w="2208" w:type="dxa"/>
-          </w:tcPr>
-          <w:p>
-            <w:r>
-              <w:t>Filled with "Unknown"</w:t>
-            </w:r>
-          </w:p>
-        </w:tc>
-        <w:tc>
-          <w:tcPr>
-            <w:tcW w:w="3864" w:type="dxa"/>
-          </w:tcPr>
-          <w:p>
-            <w:r>
-              <w:t>A person's gender should not be guessed.</w:t>
-            </w:r>
-          </w:p>
-        </w:tc>
       </w:tr>
     </w:tbl>
     <w:p/>
     <w:p>
       <w:r>
-        <w:t>No rows were deleted, so all 1,548 applicants were kept.</w:t>
-      </w:r>
-    </w:p>
-    <w:p>
-      <w:r>
         <w:rPr>
           <w:b/>
         </w:rPr>
-        <w:t>New columns created for easier reading:</w:t>
+        <w:t>New columns created:</w:t>
       </w:r>
     </w:p>
     <w:p>
@@ -1390,7 +836,7 @@
         <w:t>Age</w:t>
       </w:r>
       <w:r>
-        <w:t>: Birthday_count is in negative days, which is hard to read, so it was converted to years: Age = −Birthday_count ÷ 365.</w:t>
+        <w:t>: Birthday_count is in negative days, so it was converted to years: Age = −Birthday_count ÷ 365.</w:t>
       </w:r>
     </w:p>
     <w:p>
@@ -1404,7 +850,10 @@
         <w:t>Status</w:t>
       </w:r>
       <w:r>
-        <w:t>: label (0/1) was converted to the words Approved / Rejected so the charts are easier to read.</w:t>
+        <w:t>: label (0/1) was converted to the words Approved / Rejected</w:t>
+      </w:r>
+      <w:r>
+        <w:t>.</w:t>
       </w:r>
     </w:p>
     <w:p>
@@ -1412,7 +861,6 @@
         <w:rPr>
           <w:noProof/>
         </w:rPr>
-        <w:lastRenderedPageBreak/>
         <w:drawing>
           <wp:inline distT="0" distB="0" distL="0" distR="0" wp14:anchorId="5FA917F4" wp14:editId="7508D85C">
             <wp:extent cx="4686706" cy="3101609"/>
@@ -1450,6 +898,8 @@
         </w:drawing>
       </w:r>
     </w:p>
+    <w:p/>
+    <w:p/>
     <w:p>
       <w:pPr>
         <w:pStyle w:val="Heading1"/>
@@ -1458,12 +908,8 @@
         <w:rPr>
           <w:color w:val="1F4E79"/>
         </w:rPr>
+        <w:lastRenderedPageBreak/>
         <w:t>Tasks 4, 5, 6 — Visualizations, Interpretation, and Justification</w:t>
-      </w:r>
-    </w:p>
-    <w:p>
-      <w:r>
-        <w:t>Six charts were created. Each one answers a different question and was chosen according to the type of data:</w:t>
       </w:r>
     </w:p>
     <w:tbl>
@@ -1886,7 +1332,6 @@
         </w:tc>
       </w:tr>
     </w:tbl>
-    <w:p/>
     <w:p>
       <w:pPr>
         <w:pStyle w:val="Heading2"/>
@@ -2280,93 +1725,6 @@
       </w:r>
     </w:p>
     <w:p>
-      <w:r>
-        <w:rPr>
-          <w:b/>
-        </w:rPr>
-        <w:t>How to read a box plot:</w:t>
-      </w:r>
-    </w:p>
-    <w:p>
-      <w:pPr>
-        <w:pStyle w:val="ListBullet"/>
-      </w:pPr>
-      <w:r>
-        <w:t xml:space="preserve">The </w:t>
-      </w:r>
-      <w:r>
-        <w:rPr>
-          <w:b/>
-        </w:rPr>
-        <w:t>box</w:t>
-      </w:r>
-      <w:r>
-        <w:t xml:space="preserve"> covers the middle 50% of people, from Q1 (25% of people earn less than this) to Q3 (75% of people earn less than this).</w:t>
-      </w:r>
-    </w:p>
-    <w:p>
-      <w:pPr>
-        <w:pStyle w:val="ListBullet"/>
-      </w:pPr>
-      <w:r>
-        <w:t xml:space="preserve">The </w:t>
-      </w:r>
-      <w:r>
-        <w:rPr>
-          <w:b/>
-        </w:rPr>
-        <w:t>line inside the box</w:t>
-      </w:r>
-      <w:r>
-        <w:t xml:space="preserve"> is the median.</w:t>
-      </w:r>
-    </w:p>
-    <w:p>
-      <w:pPr>
-        <w:pStyle w:val="ListBullet"/>
-      </w:pPr>
-      <w:r>
-        <w:t xml:space="preserve">The </w:t>
-      </w:r>
-      <w:r>
-        <w:rPr>
-          <w:b/>
-        </w:rPr>
-        <w:t>whiskers</w:t>
-      </w:r>
-      <w:r>
-        <w:t xml:space="preserve"> (lines on both sides) show the normal range.</w:t>
-      </w:r>
-    </w:p>
-    <w:p>
-      <w:pPr>
-        <w:pStyle w:val="ListBullet"/>
-      </w:pPr>
-      <w:r>
-        <w:t xml:space="preserve">The </w:t>
-      </w:r>
-      <w:r>
-        <w:rPr>
-          <w:b/>
-        </w:rPr>
-        <w:t>dots</w:t>
-      </w:r>
-      <w:r>
-        <w:t xml:space="preserve"> beyond the whiskers are outliers.</w:t>
-      </w:r>
-    </w:p>
-    <w:p>
-      <w:r>
-        <w:rPr>
-          <w:b/>
-        </w:rPr>
-        <w:t>IQR rule for outliers:</w:t>
-      </w:r>
-      <w:r>
-        <w:t xml:space="preserve"> IQR (Inter-Quartile Range) = Q3 − Q1, which is the width of the box. Any income above Q3 + 1.5 × IQR is an outlier. The lower limit (Q1 − 1.5 × IQR) is negative here, so no income is a low outlier.</w:t>
-      </w:r>
-    </w:p>
-    <w:p>
       <w:pPr>
         <w:spacing w:before="200"/>
       </w:pPr>
@@ -2860,7 +2218,13 @@
         </w:numPr>
       </w:pPr>
       <w:r>
-        <w:t>No single numerical column clearly decides approval or rejection.</w:t>
+        <w:t xml:space="preserve">No single numerical column clearly </w:t>
+      </w:r>
+      <w:r>
+        <w:tab/>
+      </w:r>
+      <w:r>
+        <w:t>decides approval or rejection.</w:t>
       </w:r>
     </w:p>
     <w:p>
@@ -3233,7 +2597,7 @@
   <w:num w:numId="9" w16cid:durableId="1781030440">
     <w:abstractNumId w:val="0"/>
   </w:num>
-  <w:num w:numId="10">
+  <w:num w:numId="10" w16cid:durableId="180974812">
     <w:abstractNumId w:val="7"/>
     <w:lvlOverride w:ilvl="0">
       <w:startOverride w:val="1"/>

</xml_diff>